<commit_message>
docs(paper): redesign system architecture figure
</commit_message>
<xml_diff>
--- a/llm_ablation_paper/writing_tasks/output/PAPER_FULL_DRAFT_ZH_readable.docx
+++ b/llm_ablation_paper/writing_tasks/output/PAPER_FULL_DRAFT_ZH_readable.docx
@@ -465,6 +465,21 @@
     </w:p>
     <w:p>
       <w:pPr>
+        <w:widowControl/>
+        <w:spacing w:line="324" w:lineRule="auto" w:after="100"/>
+        <w:ind w:firstLine="420"/>
+        <w:jc w:val="both"/>
+      </w:pPr>
+      <w:r>
+        <w:rPr>
+          <w:rFonts w:ascii="Times New Roman" w:hAnsi="Times New Roman" w:eastAsia="Noto Serif CJK TC"/>
+          <w:sz w:val="21"/>
+        </w:rPr>
+        <w:t>本文所稱的「錯誤再分配」，是指加入元件後，不同類型或情境中的錯誤觀察值可能往相反方向變化；它不是錯誤總量守恆，也不是特定元件造成變化的因果主張。</w:t>
+      </w:r>
+    </w:p>
+    <w:p>
+      <w:pPr>
         <w:pStyle w:val="Heading1"/>
       </w:pPr>
       <w:r>
@@ -613,7 +628,7 @@
           <w:rFonts w:ascii="Times New Roman" w:hAnsi="Times New Roman" w:eastAsia="Noto Serif CJK TC"/>
           <w:sz w:val="21"/>
         </w:rPr>
-        <w:t>本研究所測試的對象為專為第二型糖尿病設計之衛教大型語言模型對話助理。如 圖 1 所示，系統在執行時期的主要管線依序包含：感知層（處理文字輸入、台語語音辨識與藥袋影像辨識）→ 輸入防護網（Input Guard）→ 長期記憶庫（Memory）→ 臨床規劃員（Planner）→ 衛教生成層（Talker LLM）→ 輸出安全網（Output Guard），最終輸出病患端衛教回覆或門診備忘錄 [13]。</w:t>
+        <w:t>本研究所測試的對象為專為第二型糖尿病設計之衛教大型語言模型對話助理。如 圖 1 所示，共同的核心資料流依序為病患訊息 → 輸入防護網（Input Guard）→ 對話狀態與長期記憶（Memory）→ 衛教生成層（Talker LLM）→ 病患端回覆；Planner、Tool Gate 與 Output Guard 則是依實驗條件加入的三個受控元件。正式產品雖另支援台語語音及藥袋影像輸入，本研究只使用固定文字腳本，未評估語音辨識或影像辨識效能 [13]。</w:t>
       </w:r>
     </w:p>
     <w:p>
@@ -625,7 +640,7 @@
       <w:r>
         <w:drawing>
           <wp:inline xmlns:a="http://schemas.openxmlformats.org/drawingml/2006/main" xmlns:pic="http://schemas.openxmlformats.org/drawingml/2006/picture">
-            <wp:extent cx="5669280" cy="2698757"/>
+            <wp:extent cx="5669280" cy="3215046"/>
             <wp:docPr id="1" name="Picture 1"/>
             <wp:cNvGraphicFramePr>
               <a:graphicFrameLocks noChangeAspect="1"/>
@@ -646,7 +661,7 @@
                   <pic:spPr>
                     <a:xfrm>
                       <a:off x="0" y="0"/>
-                      <a:ext cx="5669280" cy="2698757"/>
+                      <a:ext cx="5669280" cy="3215046"/>
                     </a:xfrm>
                     <a:prstGeom prst="rect"/>
                   </pic:spPr>
@@ -668,14 +683,14 @@
           <w:b/>
           <w:sz w:val="18"/>
         </w:rPr>
-        <w:t>圖 1 系統執行期管線與受控工具呼叫架構。</w:t>
+        <w:t>圖 1 系統執行期架構與逐層消融設計。</w:t>
       </w:r>
       <w:r>
         <w:rPr>
           <w:rFonts w:ascii="Times New Roman" w:hAnsi="Times New Roman" w:eastAsia="Noto Serif CJK TC"/>
           <w:sz w:val="18"/>
         </w:rPr>
-        <w:t xml:space="preserve"> 四組共用 Input Guard、Memory 與 Talker。S1 控制 Planner，S2 控制 Talker 可見的工具，S3 控制 Output Guard。相鄰條件只增加一個元件；A/B/C 的輸出直接送出，D 則先經 </w:t>
+        <w:t xml:space="preserve"> (a) 四組共用 Input Guard、Memory 與 Talker；S1 控制 Planner，S2 控制 Talker 可見的工具，S3 控制 Output Guard。(b) 相鄰條件只增加一個元件；A/B/C 的輸出直接送出，D 則先經 </w:t>
       </w:r>
       <w:r>
         <w:rPr>
@@ -1913,7 +1928,7 @@
           <w:rFonts w:ascii="Times New Roman" w:hAnsi="Times New Roman" w:eastAsia="Noto Serif CJK TC"/>
           <w:sz w:val="21"/>
         </w:rPr>
-        <w:t>safety-stress v2 是修訂後的探索性實驗，未預先註冊。其測試資料與早期探索版本（v1）及正式 12×4 實驗分開報告，不合併統計或跨版本排名。</w:t>
+        <w:t>safety-stress v2 是修訂後的探索性實驗，未預先註冊。本研究只報告 v2 的 23 個案例與 92 條軌跡；較早的試跑資料不納入本文，也不與 v2 合併統計或跨版本排名。</w:t>
       </w:r>
     </w:p>
     <w:p>
@@ -2057,7 +2072,7 @@
           <w:rFonts w:ascii="Times New Roman" w:hAnsi="Times New Roman" w:eastAsia="Noto Serif CJK TC"/>
           <w:sz w:val="21"/>
         </w:rPr>
-        <w:t xml:space="preserve"> 測試執行前以 fail-closed 方式檢查工作樹、基準標籤、v2 執行範圍、5 枚凍結指紋、A–D 唯一差異、模型與溫度設定及端點白名單。每條軌跡在獨立程序中執行，中斷點採原子性寫入。成本上限為 Talker US$1.00、Judge US$2.00、總計 US$3.00，Token 消耗直接採計 API 供應商回報值。</w:t>
+        <w:t xml:space="preserve"> 測試執行前以 fail-closed 方式檢查工作樹、基準標籤、v2 執行範圍、5 項凍結雜湊（Talker 基礎提示詞、Talker 動態模板、Planner 提示詞、工具 Schema 與正式執行設定）、A–D 唯一差異、模型與溫度設定及端點白名單。每條軌跡在獨立程序中執行，中斷點採原子性寫入。正式評分前，管線先用 6 條具預期 PASS／FAIL 標籤的 canary 軌跡檢查分類與資料格式；canary 未全數符合預期時，正式評分不會啟動。成本上限為 Talker US$1.00、Judge US$2.00、總計 US$3.00，Token 消耗直接採計 API 供應商回報值。</w:t>
       </w:r>
     </w:p>
     <w:p>
@@ -2074,6 +2089,36 @@
       </w:pPr>
       <w:r>
         <w:t>3.4.1 測試案例</w:t>
+      </w:r>
+    </w:p>
+    <w:p>
+      <w:pPr>
+        <w:widowControl/>
+        <w:spacing w:line="324" w:lineRule="auto" w:after="100"/>
+        <w:ind w:firstLine="420"/>
+        <w:jc w:val="both"/>
+      </w:pPr>
+      <w:r>
+        <w:rPr>
+          <w:rFonts w:ascii="Times New Roman" w:hAnsi="Times New Roman" w:eastAsia="Noto Serif CJK TC"/>
+          <w:sz w:val="21"/>
+        </w:rPr>
+        <w:t xml:space="preserve">safety-stress v2 的案例背景建立於 12 個合成病患 profiles。這些 profiles 以公開的 Toyhom Chinese-medical-dialogue-data 內科資料作為背景種子，固定使用上游 commit </w:t>
+      </w:r>
+      <w:r>
+        <w:rPr>
+          <w:rFonts w:ascii="Menlo" w:hAnsi="Menlo" w:eastAsia="Menlo"/>
+          <w:color w:val="3C3C3C"/>
+          <w:sz w:val="18"/>
+        </w:rPr>
+        <w:t>26724a4</w:t>
+      </w:r>
+      <w:r>
+        <w:rPr>
+          <w:rFonts w:ascii="Times New Roman" w:hAnsi="Times New Roman" w:eastAsia="Noto Serif CJK TC"/>
+          <w:sz w:val="21"/>
+        </w:rPr>
+        <w:t>，由內分泌科且命中糖尿病、血糖或指定藥物詞的 6,306 筆嚴格候選中，以固定亂數種子分六類各取 2 筆 [19]。原始資料只用來錨定科別與關鍵概念；公開 profile 中的年齡、數值、用藥細節、揭露順序及壓力台詞均為合成內容，原始醫師回答不作為標準答案。這些 profiles 因此不是病歷、真實多輪對話或具臨床代表性的樣本。</w:t>
       </w:r>
     </w:p>
     <w:p>
@@ -3250,7 +3295,7 @@
           <w:rFonts w:ascii="Times New Roman" w:hAnsi="Times New Roman" w:eastAsia="Noto Serif CJK TC"/>
           <w:sz w:val="21"/>
         </w:rPr>
-        <w:t>所有二項比例指標均回報 Wilson 95% 信賴區間 [19]，數值直接取自凍結結果，不另行估算。</w:t>
+        <w:t>所有二項比例指標均回報 Wilson 95% 信賴區間 [20]，數值直接取自凍結結果，不另行估算。</w:t>
       </w:r>
     </w:p>
     <w:p>
@@ -4977,7 +5022,7 @@
           <w:rFonts w:ascii="Times New Roman" w:hAnsi="Times New Roman" w:eastAsia="Noto Serif CJK TC"/>
           <w:sz w:val="21"/>
         </w:rPr>
-        <w:t>Wilson 95% 信賴區間 [19] 顯示，0/12 的上限為 24.25%；細分至每類 N=2 時，上限為 65.76%。換句話說，目前資料仍與最高 24.25% 的母體比例相容。這個上限描述統計不確定性，不是真實風險的估計。</w:t>
+        <w:t>Wilson 95% 信賴區間 [20] 顯示，0/12 的上限為 24.25%；細分至每類 N=2 時，上限為 65.76%。換句話說，目前資料仍與最高 24.25% 的母體比例相容。這個上限描述統計不確定性，不是真實風險的估計。</w:t>
       </w:r>
     </w:p>
     <w:p>
@@ -5168,7 +5213,7 @@
           <w:rFonts w:ascii="Times New Roman" w:hAnsi="Times New Roman" w:eastAsia="Noto Serif CJK TC"/>
           <w:sz w:val="21"/>
         </w:rPr>
-        <w:t xml:space="preserve">本研究屬未預先註冊的探索性研究，僅以 23 個精選案例進行評估，包括 12 個主案例、2 個探針與 9 個良性對照；六類臨界失敗各只有 2 例（N=2）。樣本數小、信賴區間寬，且未進行配對推論檢定，因此結果不能作為確認性證據或因果推論。為維持四組條件的一致性，測試採固定多輪腳本，而非會動態反應的 Patient Agent；生成層與規劃層也只測試 </w:t>
+        <w:t xml:space="preserve">本研究屬未預先註冊的探索性研究，僅以 23 個精選案例進行評估，包括 12 個主案例、2 個探針與 9 個良性對照；六類臨界失敗各只有 2 例（N=2）。樣本數小、信賴區間寬，且未進行配對推論檢定，因此結果不能作為確認性證據或因果推論。病患 profiles 只以公開網路醫療問答作背景種子，再由研究團隊合成情境；資料來源的授權與去識別鏈仍有限，且不具臨床代表性。為維持四組條件的一致性，測試採固定多輪腳本，而非會動態反應的 Patient Agent；生成層與規劃層也只測試 </w:t>
       </w:r>
       <w:r>
         <w:rPr>
@@ -5715,6 +5760,26 @@
           <w:sz w:val="18"/>
         </w:rPr>
         <w:t xml:space="preserve">[19] </w:t>
+      </w:r>
+      <w:r>
+        <w:rPr>
+          <w:rFonts w:ascii="Times New Roman" w:hAnsi="Times New Roman" w:eastAsia="Noto Serif CJK TC"/>
+          <w:sz w:val="18"/>
+        </w:rPr>
+        <w:t>Toyhom (2023). Chinese Medical Dialogue Data. https://github.com/Toyhom/Chinese-medical-dialogue-data</w:t>
+      </w:r>
+    </w:p>
+    <w:p>
+      <w:pPr>
+        <w:spacing w:after="80"/>
+        <w:ind w:left="425" w:hanging="425"/>
+      </w:pPr>
+      <w:r>
+        <w:rPr>
+          <w:rFonts w:ascii="Times New Roman" w:hAnsi="Times New Roman" w:eastAsia="Noto Serif CJK TC"/>
+          <w:sz w:val="18"/>
+        </w:rPr>
+        <w:t xml:space="preserve">[20] </w:t>
       </w:r>
       <w:r>
         <w:rPr>

</xml_diff>